<commit_message>
Terminología: «subregión» → «territorial» + mejora del Excel
El usuario pidió hablar de "5 territoriales", no "5 subregiones".
- Cambia el término visible a «territorial/territoriales» en toda la
  plataforma (hero, dashboard, mapa, centro de datos, módulo educativo),
  el Excel, el informe Word y el soporte documental. Se conserva el campo
  de datos interno «subregion», el archivo subregiones.geojson y el
  endpoint /subregiones.
- Excel mejorado: nueva hoja «Territoriales» con la deforestación por cada
  una de las 5 territoriales (total, ha/año, % y nº de municipios) y gráfico
  de barras. Recalculado, 0 errores de fórmula.

Co-Authored-By: Claude Opus 4.8 <noreply@anthropic.com>
</commit_message>
<xml_diff>
--- a/soporte documental/01 Ficha Tecnica de la Plataforma.docx
+++ b/soporte documental/01 Ficha Tecnica de la Plataforma.docx
@@ -712,7 +712,7 @@
         <w:rPr>
           <w:sz w:val="21"/>
         </w:rPr>
-        <w:t xml:space="preserve"> de la jurisdicción, agrupados por subregión:</w:t>
+        <w:t xml:space="preserve"> de la jurisdicción, agrupados por territorial:</w:t>
       </w:r>
     </w:p>
     <w:tbl>
@@ -802,7 +802,7 @@
                 <w:color w:val="FFFFFF"/>
                 <w:sz w:val="19"/>
               </w:rPr>
-              <w:t>Subregión</w:t>
+              <w:t>Territorial</w:t>
             </w:r>
           </w:p>
         </w:tc>
@@ -2649,7 +2649,7 @@
               <w:rPr>
                 <w:sz w:val="19"/>
               </w:rPr>
-              <w:t>Indicadores, series temporales y gráficas de deforestación por municipio, subregión y unidad territorial.</w:t>
+              <w:t>Indicadores, series temporales y gráficas de deforestación por municipio, territorial y unidad de gestión.</w:t>
             </w:r>
           </w:p>
         </w:tc>

</xml_diff>